<commit_message>
fix: checkbox lesson plan tampil bullet + rapikan pengaturan
- Hapus format bullet-list dari sel checkbox template DOCX (penyebab
  simbol centang tampil sebagai list bulat di Word)
- Aktifkan tab pengaturan 'AI Lesson Plan' (sebelumnya disabled 'Segera')
- Hapus banner info semester yang mengganggu di halaman Pengaturan

Co-Authored-By: Claude Fable 5 <noreply@anthropic.com>
</commit_message>
<xml_diff>
--- a/templates/CONTOH-HASIL-RENDER.docx
+++ b/templates/CONTOH-HASIL-RENDER.docx
@@ -1256,12 +1256,7 @@
           </w:tcPr>
           <w:p>
             <w:pPr>
-              <w:numPr>
-                <w:ilvl w:val="0"/>
-                <w:numId w:val="17"/>
-              </w:numPr>
-              <w:spacing w:after="0" w:before="0" w:line="240" w:lineRule="auto"/>
-              <w:ind w:left="720" w:right="-90" w:hanging="540"/>
+              <w:spacing w:after="0" w:before="0" w:line="240" w:lineRule="auto"/>
               <w:jc w:val="center"/>
               <w:rPr>
                 <w:rFonts w:ascii="Times New Roman" w:cs="Times New Roman" w:eastAsia="Times New Roman" w:hAnsi="Times New Roman"/>
@@ -1345,12 +1340,7 @@
           </w:tcPr>
           <w:p>
             <w:pPr>
-              <w:numPr>
-                <w:ilvl w:val="0"/>
-                <w:numId w:val="11"/>
-              </w:numPr>
-              <w:spacing w:after="0" w:before="0" w:line="240" w:lineRule="auto"/>
-              <w:ind w:left="720" w:right="-90" w:hanging="540"/>
+              <w:spacing w:after="0" w:before="0" w:line="240" w:lineRule="auto"/>
               <w:jc w:val="center"/>
               <w:rPr>
                 <w:sz w:val="24"/>
@@ -1471,12 +1461,7 @@
           </w:tcPr>
           <w:p>
             <w:pPr>
-              <w:numPr>
-                <w:ilvl w:val="0"/>
-                <w:numId w:val="2"/>
-              </w:numPr>
-              <w:spacing w:after="0" w:before="0" w:line="240" w:lineRule="auto"/>
-              <w:ind w:left="720" w:right="-90" w:hanging="540"/>
+              <w:spacing w:after="0" w:before="0" w:line="240" w:lineRule="auto"/>
               <w:jc w:val="center"/>
               <w:rPr>
                 <w:rFonts w:ascii="Times New Roman" w:cs="Times New Roman" w:eastAsia="Times New Roman" w:hAnsi="Times New Roman"/>
@@ -1560,12 +1545,7 @@
           </w:tcPr>
           <w:p>
             <w:pPr>
-              <w:numPr>
-                <w:ilvl w:val="0"/>
-                <w:numId w:val="20"/>
-              </w:numPr>
-              <w:spacing w:after="0" w:before="0" w:line="240" w:lineRule="auto"/>
-              <w:ind w:left="720" w:right="-90" w:hanging="540"/>
+              <w:spacing w:after="0" w:before="0" w:line="240" w:lineRule="auto"/>
               <w:jc w:val="center"/>
               <w:rPr>
                 <w:rFonts w:ascii="Times New Roman" w:cs="Times New Roman" w:eastAsia="Times New Roman" w:hAnsi="Times New Roman"/>
@@ -1687,12 +1667,7 @@
           </w:tcPr>
           <w:p>
             <w:pPr>
-              <w:numPr>
-                <w:ilvl w:val="0"/>
-                <w:numId w:val="25"/>
-              </w:numPr>
-              <w:spacing w:after="0" w:before="0" w:line="240" w:lineRule="auto"/>
-              <w:ind w:left="720" w:right="-90" w:hanging="540"/>
+              <w:spacing w:after="0" w:before="0" w:line="240" w:lineRule="auto"/>
               <w:jc w:val="center"/>
               <w:rPr>
                 <w:sz w:val="24"/>
@@ -1775,12 +1750,7 @@
           </w:tcPr>
           <w:p>
             <w:pPr>
-              <w:numPr>
-                <w:ilvl w:val="0"/>
-                <w:numId w:val="23"/>
-              </w:numPr>
-              <w:spacing w:after="0" w:before="0" w:line="240" w:lineRule="auto"/>
-              <w:ind w:left="720" w:right="-90" w:hanging="540"/>
+              <w:spacing w:after="0" w:before="0" w:line="240" w:lineRule="auto"/>
               <w:jc w:val="center"/>
               <w:rPr>
                 <w:rFonts w:ascii="Times New Roman" w:cs="Times New Roman" w:eastAsia="Times New Roman" w:hAnsi="Times New Roman"/>
@@ -1902,12 +1872,7 @@
           </w:tcPr>
           <w:p>
             <w:pPr>
-              <w:numPr>
-                <w:ilvl w:val="0"/>
-                <w:numId w:val="7"/>
-              </w:numPr>
-              <w:spacing w:after="0" w:before="0" w:line="240" w:lineRule="auto"/>
-              <w:ind w:left="720" w:right="-90" w:hanging="540"/>
+              <w:spacing w:after="0" w:before="0" w:line="240" w:lineRule="auto"/>
               <w:jc w:val="center"/>
               <w:rPr>
                 <w:sz w:val="24"/>
@@ -1990,12 +1955,7 @@
           </w:tcPr>
           <w:p>
             <w:pPr>
-              <w:numPr>
-                <w:ilvl w:val="0"/>
-                <w:numId w:val="29"/>
-              </w:numPr>
-              <w:spacing w:after="0" w:before="0" w:line="240" w:lineRule="auto"/>
-              <w:ind w:left="720" w:right="-90" w:hanging="540"/>
+              <w:spacing w:after="0" w:before="0" w:line="240" w:lineRule="auto"/>
               <w:jc w:val="center"/>
               <w:rPr>
                 <w:rFonts w:ascii="Times New Roman" w:cs="Times New Roman" w:eastAsia="Times New Roman" w:hAnsi="Times New Roman"/>
@@ -3129,12 +3089,7 @@
           </w:tcPr>
           <w:p>
             <w:pPr>
-              <w:numPr>
-                <w:ilvl w:val="0"/>
-                <w:numId w:val="31"/>
-              </w:numPr>
-              <w:spacing w:after="0" w:before="0" w:line="240" w:lineRule="auto"/>
-              <w:ind w:left="720" w:right="140" w:hanging="720"/>
+              <w:spacing w:after="0" w:before="0" w:line="240" w:lineRule="auto"/>
               <w:jc w:val="center"/>
               <w:rPr>
                 <w:rFonts w:ascii="Times New Roman" w:cs="Times New Roman" w:eastAsia="Times New Roman" w:hAnsi="Times New Roman"/>
@@ -3217,12 +3172,7 @@
           </w:tcPr>
           <w:p>
             <w:pPr>
-              <w:numPr>
-                <w:ilvl w:val="0"/>
-                <w:numId w:val="19"/>
-              </w:numPr>
-              <w:spacing w:after="0" w:before="0" w:line="240" w:lineRule="auto"/>
-              <w:ind w:left="720" w:right="140" w:hanging="720"/>
+              <w:spacing w:after="0" w:before="0" w:line="240" w:lineRule="auto"/>
               <w:jc w:val="center"/>
               <w:rPr>
                 <w:rFonts w:ascii="Times New Roman" w:cs="Times New Roman" w:eastAsia="Times New Roman" w:hAnsi="Times New Roman"/>
@@ -3305,12 +3255,7 @@
           </w:tcPr>
           <w:p>
             <w:pPr>
-              <w:numPr>
-                <w:ilvl w:val="0"/>
-                <w:numId w:val="36"/>
-              </w:numPr>
-              <w:spacing w:after="0" w:before="0" w:line="240" w:lineRule="auto"/>
-              <w:ind w:left="720" w:right="140" w:hanging="630"/>
+              <w:spacing w:after="0" w:before="0" w:line="240" w:lineRule="auto"/>
               <w:jc w:val="center"/>
               <w:rPr>
                 <w:rFonts w:ascii="Times New Roman" w:cs="Times New Roman" w:eastAsia="Times New Roman" w:hAnsi="Times New Roman"/>
@@ -3431,12 +3376,7 @@
           </w:tcPr>
           <w:p>
             <w:pPr>
-              <w:numPr>
-                <w:ilvl w:val="0"/>
-                <w:numId w:val="27"/>
-              </w:numPr>
-              <w:spacing w:after="0" w:before="0" w:line="240" w:lineRule="auto"/>
-              <w:ind w:left="720" w:right="140" w:hanging="720"/>
+              <w:spacing w:after="0" w:before="0" w:line="240" w:lineRule="auto"/>
               <w:jc w:val="center"/>
               <w:rPr>
                 <w:rFonts w:ascii="Times New Roman" w:cs="Times New Roman" w:eastAsia="Times New Roman" w:hAnsi="Times New Roman"/>
@@ -3519,12 +3459,7 @@
           </w:tcPr>
           <w:p>
             <w:pPr>
-              <w:numPr>
-                <w:ilvl w:val="0"/>
-                <w:numId w:val="12"/>
-              </w:numPr>
-              <w:spacing w:after="0" w:before="0" w:line="240" w:lineRule="auto"/>
-              <w:ind w:left="720" w:right="140" w:hanging="720"/>
+              <w:spacing w:after="0" w:before="0" w:line="240" w:lineRule="auto"/>
               <w:jc w:val="center"/>
               <w:rPr>
                 <w:sz w:val="24"/>
@@ -3606,12 +3541,7 @@
           </w:tcPr>
           <w:p>
             <w:pPr>
-              <w:numPr>
-                <w:ilvl w:val="0"/>
-                <w:numId w:val="24"/>
-              </w:numPr>
-              <w:spacing w:after="0" w:before="0" w:line="240" w:lineRule="auto"/>
-              <w:ind w:left="720" w:right="140" w:hanging="630"/>
+              <w:spacing w:after="0" w:before="0" w:line="240" w:lineRule="auto"/>
               <w:jc w:val="center"/>
               <w:rPr>
                 <w:sz w:val="24"/>
@@ -3731,12 +3661,7 @@
           </w:tcPr>
           <w:p>
             <w:pPr>
-              <w:numPr>
-                <w:ilvl w:val="0"/>
-                <w:numId w:val="21"/>
-              </w:numPr>
-              <w:spacing w:after="0" w:before="0" w:line="240" w:lineRule="auto"/>
-              <w:ind w:left="720" w:right="140" w:hanging="720"/>
+              <w:spacing w:after="0" w:before="0" w:line="240" w:lineRule="auto"/>
               <w:jc w:val="center"/>
               <w:rPr>
                 <w:rFonts w:ascii="Times New Roman" w:cs="Times New Roman" w:eastAsia="Times New Roman" w:hAnsi="Times New Roman"/>
@@ -3819,12 +3744,7 @@
           </w:tcPr>
           <w:p>
             <w:pPr>
-              <w:numPr>
-                <w:ilvl w:val="0"/>
-                <w:numId w:val="8"/>
-              </w:numPr>
-              <w:spacing w:after="0" w:before="0" w:line="240" w:lineRule="auto"/>
-              <w:ind w:left="720" w:right="140" w:hanging="720"/>
+              <w:spacing w:after="0" w:before="0" w:line="240" w:lineRule="auto"/>
               <w:jc w:val="center"/>
               <w:rPr>
                 <w:sz w:val="24"/>
@@ -3906,12 +3826,7 @@
           </w:tcPr>
           <w:p>
             <w:pPr>
-              <w:numPr>
-                <w:ilvl w:val="0"/>
-                <w:numId w:val="28"/>
-              </w:numPr>
-              <w:spacing w:after="0" w:before="0" w:line="240" w:lineRule="auto"/>
-              <w:ind w:left="720" w:right="140" w:hanging="630"/>
+              <w:spacing w:after="0" w:before="0" w:line="240" w:lineRule="auto"/>
               <w:jc w:val="center"/>
               <w:rPr>
                 <w:sz w:val="24"/>
@@ -4031,12 +3946,7 @@
           </w:tcPr>
           <w:p>
             <w:pPr>
-              <w:numPr>
-                <w:ilvl w:val="0"/>
-                <w:numId w:val="32"/>
-              </w:numPr>
-              <w:spacing w:after="0" w:before="0" w:line="240" w:lineRule="auto"/>
-              <w:ind w:left="720" w:right="140" w:hanging="720"/>
+              <w:spacing w:after="0" w:before="0" w:line="240" w:lineRule="auto"/>
               <w:jc w:val="center"/>
               <w:rPr>
                 <w:rFonts w:ascii="Times New Roman" w:cs="Times New Roman" w:eastAsia="Times New Roman" w:hAnsi="Times New Roman"/>
@@ -4119,12 +4029,7 @@
           </w:tcPr>
           <w:p>
             <w:pPr>
-              <w:numPr>
-                <w:ilvl w:val="0"/>
-                <w:numId w:val="5"/>
-              </w:numPr>
-              <w:spacing w:after="0" w:before="0" w:line="240" w:lineRule="auto"/>
-              <w:ind w:left="720" w:right="140" w:hanging="720"/>
+              <w:spacing w:after="0" w:before="0" w:line="240" w:lineRule="auto"/>
               <w:jc w:val="center"/>
               <w:rPr>
                 <w:sz w:val="24"/>
@@ -4206,12 +4111,7 @@
           </w:tcPr>
           <w:p>
             <w:pPr>
-              <w:numPr>
-                <w:ilvl w:val="0"/>
-                <w:numId w:val="4"/>
-              </w:numPr>
-              <w:spacing w:after="0" w:before="0" w:line="240" w:lineRule="auto"/>
-              <w:ind w:left="720" w:right="140" w:hanging="630"/>
+              <w:spacing w:after="0" w:before="0" w:line="240" w:lineRule="auto"/>
               <w:jc w:val="center"/>
               <w:rPr>
                 <w:sz w:val="24"/>
@@ -4331,12 +4231,7 @@
           </w:tcPr>
           <w:p>
             <w:pPr>
-              <w:numPr>
-                <w:ilvl w:val="0"/>
-                <w:numId w:val="1"/>
-              </w:numPr>
-              <w:spacing w:after="0" w:before="0" w:line="240" w:lineRule="auto"/>
-              <w:ind w:left="720" w:right="140" w:hanging="720"/>
+              <w:spacing w:after="0" w:before="0" w:line="240" w:lineRule="auto"/>
               <w:jc w:val="center"/>
               <w:rPr>
                 <w:rFonts w:ascii="Times New Roman" w:cs="Times New Roman" w:eastAsia="Times New Roman" w:hAnsi="Times New Roman"/>
@@ -4419,12 +4314,7 @@
           </w:tcPr>
           <w:p>
             <w:pPr>
-              <w:numPr>
-                <w:ilvl w:val="0"/>
-                <w:numId w:val="16"/>
-              </w:numPr>
-              <w:spacing w:after="0" w:before="0" w:line="240" w:lineRule="auto"/>
-              <w:ind w:left="720" w:right="140" w:hanging="720"/>
+              <w:spacing w:after="0" w:before="0" w:line="240" w:lineRule="auto"/>
               <w:jc w:val="center"/>
               <w:rPr>
                 <w:rFonts w:ascii="Times New Roman" w:cs="Times New Roman" w:eastAsia="Times New Roman" w:hAnsi="Times New Roman"/>
@@ -4507,12 +4397,7 @@
           </w:tcPr>
           <w:p>
             <w:pPr>
-              <w:numPr>
-                <w:ilvl w:val="0"/>
-                <w:numId w:val="10"/>
-              </w:numPr>
-              <w:spacing w:after="0" w:before="0" w:line="240" w:lineRule="auto"/>
-              <w:ind w:left="720" w:right="140" w:hanging="630"/>
+              <w:spacing w:after="0" w:before="0" w:line="240" w:lineRule="auto"/>
               <w:jc w:val="center"/>
               <w:rPr>
                 <w:rFonts w:ascii="Times New Roman" w:cs="Times New Roman" w:eastAsia="Times New Roman" w:hAnsi="Times New Roman"/>
@@ -4633,12 +4518,7 @@
           </w:tcPr>
           <w:p>
             <w:pPr>
-              <w:numPr>
-                <w:ilvl w:val="0"/>
-                <w:numId w:val="18"/>
-              </w:numPr>
-              <w:spacing w:after="0" w:before="0" w:line="240" w:lineRule="auto"/>
-              <w:ind w:left="720" w:right="140" w:hanging="720"/>
+              <w:spacing w:after="0" w:before="0" w:line="240" w:lineRule="auto"/>
               <w:jc w:val="center"/>
               <w:rPr>
                 <w:sz w:val="24"/>
@@ -4720,12 +4600,7 @@
           </w:tcPr>
           <w:p>
             <w:pPr>
-              <w:numPr>
-                <w:ilvl w:val="0"/>
-                <w:numId w:val="22"/>
-              </w:numPr>
-              <w:spacing w:after="0" w:before="0" w:line="240" w:lineRule="auto"/>
-              <w:ind w:left="720" w:right="140" w:hanging="720"/>
+              <w:spacing w:after="0" w:before="0" w:line="240" w:lineRule="auto"/>
               <w:jc w:val="center"/>
               <w:rPr>
                 <w:rFonts w:ascii="Times New Roman" w:cs="Times New Roman" w:eastAsia="Times New Roman" w:hAnsi="Times New Roman"/>
@@ -4808,12 +4683,7 @@
           </w:tcPr>
           <w:p>
             <w:pPr>
-              <w:numPr>
-                <w:ilvl w:val="0"/>
-                <w:numId w:val="34"/>
-              </w:numPr>
-              <w:spacing w:after="0" w:before="0" w:line="240" w:lineRule="auto"/>
-              <w:ind w:left="720" w:right="140" w:hanging="630"/>
+              <w:spacing w:after="0" w:before="0" w:line="240" w:lineRule="auto"/>
               <w:jc w:val="center"/>
               <w:rPr>
                 <w:sz w:val="24"/>
@@ -4933,12 +4803,7 @@
           </w:tcPr>
           <w:p>
             <w:pPr>
-              <w:numPr>
-                <w:ilvl w:val="0"/>
-                <w:numId w:val="33"/>
-              </w:numPr>
-              <w:spacing w:after="0" w:before="0" w:line="240" w:lineRule="auto"/>
-              <w:ind w:left="720" w:right="140" w:hanging="720"/>
+              <w:spacing w:after="0" w:before="0" w:line="240" w:lineRule="auto"/>
               <w:jc w:val="center"/>
               <w:rPr>
                 <w:rFonts w:ascii="Times New Roman" w:cs="Times New Roman" w:eastAsia="Times New Roman" w:hAnsi="Times New Roman"/>
@@ -5098,12 +4963,7 @@
           </w:tcPr>
           <w:p>
             <w:pPr>
-              <w:numPr>
-                <w:ilvl w:val="0"/>
-                <w:numId w:val="3"/>
-              </w:numPr>
-              <w:spacing w:after="0" w:before="0" w:line="240" w:lineRule="auto"/>
-              <w:ind w:left="720" w:right="140" w:hanging="630"/>
+              <w:spacing w:after="0" w:before="0" w:line="240" w:lineRule="auto"/>
               <w:jc w:val="center"/>
               <w:rPr>
                 <w:rFonts w:ascii="Times New Roman" w:cs="Times New Roman" w:eastAsia="Times New Roman" w:hAnsi="Times New Roman"/>
@@ -9068,12 +8928,7 @@
           </w:tcPr>
           <w:p>
             <w:pPr>
-              <w:numPr>
-                <w:ilvl w:val="0"/>
-                <w:numId w:val="13"/>
-              </w:numPr>
-              <w:spacing w:after="0" w:before="0" w:line="240" w:lineRule="auto"/>
-              <w:ind w:left="720" w:right="140" w:hanging="360"/>
+              <w:spacing w:after="0" w:before="0" w:line="240" w:lineRule="auto"/>
               <w:jc w:val="center"/>
               <w:rPr>
                 <w:sz w:val="24"/>
@@ -9156,12 +9011,7 @@
           </w:tcPr>
           <w:p>
             <w:pPr>
-              <w:numPr>
-                <w:ilvl w:val="0"/>
-                <w:numId w:val="15"/>
-              </w:numPr>
-              <w:spacing w:after="0" w:before="0" w:line="240" w:lineRule="auto"/>
-              <w:ind w:left="720" w:right="140" w:hanging="360"/>
+              <w:spacing w:after="0" w:before="0" w:line="240" w:lineRule="auto"/>
               <w:rPr>
                 <w:sz w:val="24"/>
                 <w:szCs w:val="24"/>
@@ -9281,12 +9131,7 @@
           </w:tcPr>
           <w:p>
             <w:pPr>
-              <w:numPr>
-                <w:ilvl w:val="0"/>
-                <w:numId w:val="35"/>
-              </w:numPr>
-              <w:spacing w:after="0" w:before="0" w:line="240" w:lineRule="auto"/>
-              <w:ind w:left="720" w:right="140" w:hanging="360"/>
+              <w:spacing w:after="0" w:before="0" w:line="240" w:lineRule="auto"/>
               <w:jc w:val="center"/>
               <w:rPr>
                 <w:rFonts w:ascii="Times New Roman" w:cs="Times New Roman" w:eastAsia="Times New Roman" w:hAnsi="Times New Roman"/>
@@ -9372,12 +9217,7 @@
           </w:tcPr>
           <w:p>
             <w:pPr>
-              <w:numPr>
-                <w:ilvl w:val="0"/>
-                <w:numId w:val="14"/>
-              </w:numPr>
-              <w:spacing w:after="0" w:before="0" w:line="240" w:lineRule="auto"/>
-              <w:ind w:left="720" w:right="140" w:hanging="360"/>
+              <w:spacing w:after="0" w:before="0" w:line="240" w:lineRule="auto"/>
               <w:rPr>
                 <w:rFonts w:ascii="Times New Roman" w:cs="Times New Roman" w:eastAsia="Times New Roman" w:hAnsi="Times New Roman"/>
                 <w:b w:val="1"/>
@@ -9500,12 +9340,7 @@
           </w:tcPr>
           <w:p>
             <w:pPr>
-              <w:numPr>
-                <w:ilvl w:val="0"/>
-                <w:numId w:val="6"/>
-              </w:numPr>
-              <w:spacing w:after="0" w:before="0" w:line="240" w:lineRule="auto"/>
-              <w:ind w:left="720" w:right="140" w:hanging="360"/>
+              <w:spacing w:after="0" w:before="0" w:line="240" w:lineRule="auto"/>
               <w:jc w:val="center"/>
               <w:rPr>
                 <w:sz w:val="24"/>
@@ -9588,12 +9423,7 @@
           </w:tcPr>
           <w:p>
             <w:pPr>
-              <w:numPr>
-                <w:ilvl w:val="0"/>
-                <w:numId w:val="30"/>
-              </w:numPr>
-              <w:spacing w:after="0" w:before="0" w:line="240" w:lineRule="auto"/>
-              <w:ind w:left="720" w:right="140" w:hanging="360"/>
+              <w:spacing w:after="0" w:before="0" w:line="240" w:lineRule="auto"/>
               <w:rPr>
                 <w:sz w:val="24"/>
                 <w:szCs w:val="24"/>
@@ -9713,12 +9543,7 @@
           </w:tcPr>
           <w:p>
             <w:pPr>
-              <w:numPr>
-                <w:ilvl w:val="0"/>
-                <w:numId w:val="9"/>
-              </w:numPr>
-              <w:spacing w:after="0" w:before="0" w:line="240" w:lineRule="auto"/>
-              <w:ind w:left="720" w:right="140" w:hanging="360"/>
+              <w:spacing w:after="0" w:before="0" w:line="240" w:lineRule="auto"/>
               <w:jc w:val="center"/>
               <w:rPr>
                 <w:rFonts w:ascii="Times New Roman" w:cs="Times New Roman" w:eastAsia="Times New Roman" w:hAnsi="Times New Roman"/>
@@ -9804,12 +9629,7 @@
           </w:tcPr>
           <w:p>
             <w:pPr>
-              <w:numPr>
-                <w:ilvl w:val="0"/>
-                <w:numId w:val="26"/>
-              </w:numPr>
-              <w:spacing w:after="0" w:before="0" w:line="240" w:lineRule="auto"/>
-              <w:ind w:left="720" w:right="140" w:hanging="360"/>
+              <w:spacing w:after="0" w:before="0" w:line="240" w:lineRule="auto"/>
               <w:rPr>
                 <w:rFonts w:ascii="Times New Roman" w:cs="Times New Roman" w:eastAsia="Times New Roman" w:hAnsi="Times New Roman"/>
                 <w:b w:val="1"/>

</xml_diff>